<commit_message>
thay dổi file word cau 1
</commit_message>
<xml_diff>
--- a/Cau1ChiThanh.docx
+++ b/Cau1ChiThanh.docx
@@ -24,13 +24,7 @@
     </w:p>
     <w:p>
       <w:r>
-        <w:t xml:space="preserve">Git diff mian </w:t>
-      </w:r>
-      <w:r>
-        <w:t>chithanh</w:t>
-      </w:r>
-      <w:r>
-        <w:t xml:space="preserve">  :so sánh t</w:t>
+        <w:t>Git diff mian chithanh  :so sánh t</w:t>
       </w:r>
       <w:r>
         <w:rPr>
@@ -62,13 +56,22 @@
     </w:p>
     <w:p>
       <w:r>
-        <w:t xml:space="preserve">Git diff mian </w:t>
-      </w:r>
-      <w:r>
-        <w:t>chithanh</w:t>
-      </w:r>
-      <w:r>
-        <w:t xml:space="preserve"> a.txt : chỉ so sánh ở file a.txt của cả 2</w:t>
+        <w:t>Git diff mian chithanh a.txt : chỉ so sánh ở file a.txt của cả 2</w:t>
+      </w:r>
+    </w:p>
+    <w:p>
+      <w:r>
+        <w:t>Câu 2:</w:t>
+      </w:r>
+    </w:p>
+    <w:p>
+      <w:r>
+        <w:t>Đối với file c++ : mở file trong môi trương c++ để chạy</w:t>
+      </w:r>
+    </w:p>
+    <w:p>
+      <w:r>
+        <w:t>Đối với file .sh: chạy trong máy ảo ubuntu linux mới có đủ môi trường</w:t>
       </w:r>
     </w:p>
     <w:p/>

</xml_diff>